<commit_message>
Remove blank line between character and dialogue.
Closes #5.
</commit_message>
<xml_diff>
--- a/fountain-ref.docx
+++ b/fountain-ref.docx
@@ -1,6 +1,6 @@
 
 <file path=word/document.xml><?xml version="1.0" encoding="utf-8"?>
-<w:document xmlns:wpc="http://schemas.microsoft.com/office/word/2010/wordprocessingCanvas" xmlns:cx="http://schemas.microsoft.com/office/drawing/2014/chartex" xmlns:cx1="http://schemas.microsoft.com/office/drawing/2015/9/8/chartex" xmlns:cx2="http://schemas.microsoft.com/office/drawing/2015/10/21/chartex" xmlns:cx3="http://schemas.microsoft.com/office/drawing/2016/5/9/chartex" xmlns:cx4="http://schemas.microsoft.com/office/drawing/2016/5/10/chartex" xmlns:cx5="http://schemas.microsoft.com/office/drawing/2016/5/11/chartex" xmlns:cx6="http://schemas.microsoft.com/office/drawing/2016/5/12/chartex" xmlns:cx7="http://schemas.microsoft.com/office/drawing/2016/5/13/chartex" xmlns:cx8="http://schemas.microsoft.com/office/drawing/2016/5/14/chartex" xmlns:mc="http://schemas.openxmlformats.org/markup-compatibility/2006" xmlns:aink="http://schemas.microsoft.com/office/drawing/2016/ink" xmlns:am3d="http://schemas.microsoft.com/office/drawing/2017/model3d" xmlns:o="urn:schemas-microsoft-com:office:office" xmlns:r="http://schemas.openxmlformats.org/officeDocument/2006/relationships" xmlns:m="http://schemas.openxmlformats.org/officeDocument/2006/math" xmlns:v="urn:schemas-microsoft-com:vml" xmlns:wp14="http://schemas.microsoft.com/office/word/2010/wordprocessingDrawing" xmlns:wp="http://schemas.openxmlformats.org/drawingml/2006/wordprocessingDrawing" xmlns:w10="urn:schemas-microsoft-com:office:word" xmlns:w="http://schemas.openxmlformats.org/wordprocessingml/2006/main" xmlns:w14="http://schemas.microsoft.com/office/word/2010/wordml" xmlns:w15="http://schemas.microsoft.com/office/word/2012/wordml" xmlns:w16cex="http://schemas.microsoft.com/office/word/2018/wordml/cex" xmlns:w16cid="http://schemas.microsoft.com/office/word/2016/wordml/cid" xmlns:w16="http://schemas.microsoft.com/office/word/2018/wordml" xmlns:w16se="http://schemas.microsoft.com/office/word/2015/wordml/symex" xmlns:wpg="http://schemas.microsoft.com/office/word/2010/wordprocessingGroup" xmlns:wpi="http://schemas.microsoft.com/office/word/2010/wordprocessingInk" xmlns:wne="http://schemas.microsoft.com/office/word/2006/wordml" xmlns:wps="http://schemas.microsoft.com/office/word/2010/wordprocessingShape" mc:Ignorable="w14 w15 w16se w16cid w16 w16cex wp14">
+<w:document xmlns:wpc="http://schemas.microsoft.com/office/word/2010/wordprocessingCanvas" xmlns:cx="http://schemas.microsoft.com/office/drawing/2014/chartex" xmlns:cx1="http://schemas.microsoft.com/office/drawing/2015/9/8/chartex" xmlns:cx2="http://schemas.microsoft.com/office/drawing/2015/10/21/chartex" xmlns:cx3="http://schemas.microsoft.com/office/drawing/2016/5/9/chartex" xmlns:cx4="http://schemas.microsoft.com/office/drawing/2016/5/10/chartex" xmlns:cx5="http://schemas.microsoft.com/office/drawing/2016/5/11/chartex" xmlns:cx6="http://schemas.microsoft.com/office/drawing/2016/5/12/chartex" xmlns:cx7="http://schemas.microsoft.com/office/drawing/2016/5/13/chartex" xmlns:cx8="http://schemas.microsoft.com/office/drawing/2016/5/14/chartex" xmlns:mc="http://schemas.openxmlformats.org/markup-compatibility/2006" xmlns:aink="http://schemas.microsoft.com/office/drawing/2016/ink" xmlns:am3d="http://schemas.microsoft.com/office/drawing/2017/model3d" xmlns:o="urn:schemas-microsoft-com:office:office" xmlns:oel="http://schemas.microsoft.com/office/2019/extlst" xmlns:r="http://schemas.openxmlformats.org/officeDocument/2006/relationships" xmlns:m="http://schemas.openxmlformats.org/officeDocument/2006/math" xmlns:v="urn:schemas-microsoft-com:vml" xmlns:wp14="http://schemas.microsoft.com/office/word/2010/wordprocessingDrawing" xmlns:wp="http://schemas.openxmlformats.org/drawingml/2006/wordprocessingDrawing" xmlns:w10="urn:schemas-microsoft-com:office:word" xmlns:w="http://schemas.openxmlformats.org/wordprocessingml/2006/main" xmlns:w14="http://schemas.microsoft.com/office/word/2010/wordml" xmlns:w15="http://schemas.microsoft.com/office/word/2012/wordml" xmlns:w16cex="http://schemas.microsoft.com/office/word/2018/wordml/cex" xmlns:w16cid="http://schemas.microsoft.com/office/word/2016/wordml/cid" xmlns:w16="http://schemas.microsoft.com/office/word/2018/wordml" xmlns:w16du="http://schemas.microsoft.com/office/word/2023/wordml/word16du" xmlns:w16sdtdh="http://schemas.microsoft.com/office/word/2020/wordml/sdtdatahash" xmlns:w16sdtfl="http://schemas.microsoft.com/office/word/2024/wordml/sdtformatlock" xmlns:w16se="http://schemas.microsoft.com/office/word/2015/wordml/symex" xmlns:wpg="http://schemas.microsoft.com/office/word/2010/wordprocessingGroup" xmlns:wpi="http://schemas.microsoft.com/office/word/2010/wordprocessingInk" xmlns:wne="http://schemas.microsoft.com/office/word/2006/wordml" xmlns:wps="http://schemas.microsoft.com/office/word/2010/wordprocessingShape" mc:Ignorable="w14 w15 w16se w16cid w16 w16cex w16sdtdh w16sdtfl w16du wp14">
   <w:body>
     <w:p>
       <w:pPr>
@@ -134,7 +134,7 @@
 </file>
 
 <file path=word/endnotes.xml><?xml version="1.0" encoding="utf-8"?>
-<w:endnotes xmlns:wpc="http://schemas.microsoft.com/office/word/2010/wordprocessingCanvas" xmlns:cx="http://schemas.microsoft.com/office/drawing/2014/chartex" xmlns:cx1="http://schemas.microsoft.com/office/drawing/2015/9/8/chartex" xmlns:cx2="http://schemas.microsoft.com/office/drawing/2015/10/21/chartex" xmlns:cx3="http://schemas.microsoft.com/office/drawing/2016/5/9/chartex" xmlns:cx4="http://schemas.microsoft.com/office/drawing/2016/5/10/chartex" xmlns:cx5="http://schemas.microsoft.com/office/drawing/2016/5/11/chartex" xmlns:cx6="http://schemas.microsoft.com/office/drawing/2016/5/12/chartex" xmlns:cx7="http://schemas.microsoft.com/office/drawing/2016/5/13/chartex" xmlns:cx8="http://schemas.microsoft.com/office/drawing/2016/5/14/chartex" xmlns:mc="http://schemas.openxmlformats.org/markup-compatibility/2006" xmlns:aink="http://schemas.microsoft.com/office/drawing/2016/ink" xmlns:am3d="http://schemas.microsoft.com/office/drawing/2017/model3d" xmlns:o="urn:schemas-microsoft-com:office:office" xmlns:r="http://schemas.openxmlformats.org/officeDocument/2006/relationships" xmlns:m="http://schemas.openxmlformats.org/officeDocument/2006/math" xmlns:v="urn:schemas-microsoft-com:vml" xmlns:wp14="http://schemas.microsoft.com/office/word/2010/wordprocessingDrawing" xmlns:wp="http://schemas.openxmlformats.org/drawingml/2006/wordprocessingDrawing" xmlns:w10="urn:schemas-microsoft-com:office:word" xmlns:w="http://schemas.openxmlformats.org/wordprocessingml/2006/main" xmlns:w14="http://schemas.microsoft.com/office/word/2010/wordml" xmlns:w15="http://schemas.microsoft.com/office/word/2012/wordml" xmlns:w16cex="http://schemas.microsoft.com/office/word/2018/wordml/cex" xmlns:w16cid="http://schemas.microsoft.com/office/word/2016/wordml/cid" xmlns:w16="http://schemas.microsoft.com/office/word/2018/wordml" xmlns:w16se="http://schemas.microsoft.com/office/word/2015/wordml/symex" xmlns:wpg="http://schemas.microsoft.com/office/word/2010/wordprocessingGroup" xmlns:wpi="http://schemas.microsoft.com/office/word/2010/wordprocessingInk" xmlns:wne="http://schemas.microsoft.com/office/word/2006/wordml" xmlns:wps="http://schemas.microsoft.com/office/word/2010/wordprocessingShape" mc:Ignorable="w14 w15 w16se w16cid w16 w16cex wp14">
+<w:endnotes xmlns:wpc="http://schemas.microsoft.com/office/word/2010/wordprocessingCanvas" xmlns:cx="http://schemas.microsoft.com/office/drawing/2014/chartex" xmlns:cx1="http://schemas.microsoft.com/office/drawing/2015/9/8/chartex" xmlns:cx2="http://schemas.microsoft.com/office/drawing/2015/10/21/chartex" xmlns:cx3="http://schemas.microsoft.com/office/drawing/2016/5/9/chartex" xmlns:cx4="http://schemas.microsoft.com/office/drawing/2016/5/10/chartex" xmlns:cx5="http://schemas.microsoft.com/office/drawing/2016/5/11/chartex" xmlns:cx6="http://schemas.microsoft.com/office/drawing/2016/5/12/chartex" xmlns:cx7="http://schemas.microsoft.com/office/drawing/2016/5/13/chartex" xmlns:cx8="http://schemas.microsoft.com/office/drawing/2016/5/14/chartex" xmlns:mc="http://schemas.openxmlformats.org/markup-compatibility/2006" xmlns:aink="http://schemas.microsoft.com/office/drawing/2016/ink" xmlns:am3d="http://schemas.microsoft.com/office/drawing/2017/model3d" xmlns:o="urn:schemas-microsoft-com:office:office" xmlns:oel="http://schemas.microsoft.com/office/2019/extlst" xmlns:r="http://schemas.openxmlformats.org/officeDocument/2006/relationships" xmlns:m="http://schemas.openxmlformats.org/officeDocument/2006/math" xmlns:v="urn:schemas-microsoft-com:vml" xmlns:wp14="http://schemas.microsoft.com/office/word/2010/wordprocessingDrawing" xmlns:wp="http://schemas.openxmlformats.org/drawingml/2006/wordprocessingDrawing" xmlns:w10="urn:schemas-microsoft-com:office:word" xmlns:w="http://schemas.openxmlformats.org/wordprocessingml/2006/main" xmlns:w14="http://schemas.microsoft.com/office/word/2010/wordml" xmlns:w15="http://schemas.microsoft.com/office/word/2012/wordml" xmlns:w16cex="http://schemas.microsoft.com/office/word/2018/wordml/cex" xmlns:w16cid="http://schemas.microsoft.com/office/word/2016/wordml/cid" xmlns:w16="http://schemas.microsoft.com/office/word/2018/wordml" xmlns:w16du="http://schemas.microsoft.com/office/word/2023/wordml/word16du" xmlns:w16sdtdh="http://schemas.microsoft.com/office/word/2020/wordml/sdtdatahash" xmlns:w16sdtfl="http://schemas.microsoft.com/office/word/2024/wordml/sdtformatlock" xmlns:w16se="http://schemas.microsoft.com/office/word/2015/wordml/symex" xmlns:wpg="http://schemas.microsoft.com/office/word/2010/wordprocessingGroup" xmlns:wpi="http://schemas.microsoft.com/office/word/2010/wordprocessingInk" xmlns:wne="http://schemas.microsoft.com/office/word/2006/wordml" xmlns:wps="http://schemas.microsoft.com/office/word/2010/wordprocessingShape" mc:Ignorable="w14 w15 w16se w16cid w16 w16cex w16sdtdh w16sdtfl w16du wp14">
   <w:endnote w:type="separator" w:id="-1">
     <w:p>
       <w:pPr>
@@ -159,7 +159,7 @@
 </file>
 
 <file path=word/footnotes.xml><?xml version="1.0" encoding="utf-8"?>
-<w:footnotes xmlns:wpc="http://schemas.microsoft.com/office/word/2010/wordprocessingCanvas" xmlns:cx="http://schemas.microsoft.com/office/drawing/2014/chartex" xmlns:cx1="http://schemas.microsoft.com/office/drawing/2015/9/8/chartex" xmlns:cx2="http://schemas.microsoft.com/office/drawing/2015/10/21/chartex" xmlns:cx3="http://schemas.microsoft.com/office/drawing/2016/5/9/chartex" xmlns:cx4="http://schemas.microsoft.com/office/drawing/2016/5/10/chartex" xmlns:cx5="http://schemas.microsoft.com/office/drawing/2016/5/11/chartex" xmlns:cx6="http://schemas.microsoft.com/office/drawing/2016/5/12/chartex" xmlns:cx7="http://schemas.microsoft.com/office/drawing/2016/5/13/chartex" xmlns:cx8="http://schemas.microsoft.com/office/drawing/2016/5/14/chartex" xmlns:mc="http://schemas.openxmlformats.org/markup-compatibility/2006" xmlns:aink="http://schemas.microsoft.com/office/drawing/2016/ink" xmlns:am3d="http://schemas.microsoft.com/office/drawing/2017/model3d" xmlns:o="urn:schemas-microsoft-com:office:office" xmlns:r="http://schemas.openxmlformats.org/officeDocument/2006/relationships" xmlns:m="http://schemas.openxmlformats.org/officeDocument/2006/math" xmlns:v="urn:schemas-microsoft-com:vml" xmlns:wp14="http://schemas.microsoft.com/office/word/2010/wordprocessingDrawing" xmlns:wp="http://schemas.openxmlformats.org/drawingml/2006/wordprocessingDrawing" xmlns:w10="urn:schemas-microsoft-com:office:word" xmlns:w="http://schemas.openxmlformats.org/wordprocessingml/2006/main" xmlns:w14="http://schemas.microsoft.com/office/word/2010/wordml" xmlns:w15="http://schemas.microsoft.com/office/word/2012/wordml" xmlns:w16cex="http://schemas.microsoft.com/office/word/2018/wordml/cex" xmlns:w16cid="http://schemas.microsoft.com/office/word/2016/wordml/cid" xmlns:w16="http://schemas.microsoft.com/office/word/2018/wordml" xmlns:w16se="http://schemas.microsoft.com/office/word/2015/wordml/symex" xmlns:wpg="http://schemas.microsoft.com/office/word/2010/wordprocessingGroup" xmlns:wpi="http://schemas.microsoft.com/office/word/2010/wordprocessingInk" xmlns:wne="http://schemas.microsoft.com/office/word/2006/wordml" xmlns:wps="http://schemas.microsoft.com/office/word/2010/wordprocessingShape" mc:Ignorable="w14 w15 w16se w16cid w16 w16cex wp14">
+<w:footnotes xmlns:wpc="http://schemas.microsoft.com/office/word/2010/wordprocessingCanvas" xmlns:cx="http://schemas.microsoft.com/office/drawing/2014/chartex" xmlns:cx1="http://schemas.microsoft.com/office/drawing/2015/9/8/chartex" xmlns:cx2="http://schemas.microsoft.com/office/drawing/2015/10/21/chartex" xmlns:cx3="http://schemas.microsoft.com/office/drawing/2016/5/9/chartex" xmlns:cx4="http://schemas.microsoft.com/office/drawing/2016/5/10/chartex" xmlns:cx5="http://schemas.microsoft.com/office/drawing/2016/5/11/chartex" xmlns:cx6="http://schemas.microsoft.com/office/drawing/2016/5/12/chartex" xmlns:cx7="http://schemas.microsoft.com/office/drawing/2016/5/13/chartex" xmlns:cx8="http://schemas.microsoft.com/office/drawing/2016/5/14/chartex" xmlns:mc="http://schemas.openxmlformats.org/markup-compatibility/2006" xmlns:aink="http://schemas.microsoft.com/office/drawing/2016/ink" xmlns:am3d="http://schemas.microsoft.com/office/drawing/2017/model3d" xmlns:o="urn:schemas-microsoft-com:office:office" xmlns:oel="http://schemas.microsoft.com/office/2019/extlst" xmlns:r="http://schemas.openxmlformats.org/officeDocument/2006/relationships" xmlns:m="http://schemas.openxmlformats.org/officeDocument/2006/math" xmlns:v="urn:schemas-microsoft-com:vml" xmlns:wp14="http://schemas.microsoft.com/office/word/2010/wordprocessingDrawing" xmlns:wp="http://schemas.openxmlformats.org/drawingml/2006/wordprocessingDrawing" xmlns:w10="urn:schemas-microsoft-com:office:word" xmlns:w="http://schemas.openxmlformats.org/wordprocessingml/2006/main" xmlns:w14="http://schemas.microsoft.com/office/word/2010/wordml" xmlns:w15="http://schemas.microsoft.com/office/word/2012/wordml" xmlns:w16cex="http://schemas.microsoft.com/office/word/2018/wordml/cex" xmlns:w16cid="http://schemas.microsoft.com/office/word/2016/wordml/cid" xmlns:w16="http://schemas.microsoft.com/office/word/2018/wordml" xmlns:w16du="http://schemas.microsoft.com/office/word/2023/wordml/word16du" xmlns:w16sdtdh="http://schemas.microsoft.com/office/word/2020/wordml/sdtdatahash" xmlns:w16sdtfl="http://schemas.microsoft.com/office/word/2024/wordml/sdtformatlock" xmlns:w16se="http://schemas.microsoft.com/office/word/2015/wordml/symex" xmlns:wpg="http://schemas.microsoft.com/office/word/2010/wordprocessingGroup" xmlns:wpi="http://schemas.microsoft.com/office/word/2010/wordprocessingInk" xmlns:wne="http://schemas.microsoft.com/office/word/2006/wordml" xmlns:wps="http://schemas.microsoft.com/office/word/2010/wordprocessingShape" mc:Ignorable="w14 w15 w16se w16cid w16 w16cex w16sdtdh w16sdtfl w16du wp14">
   <w:footnote w:type="separator" w:id="-1">
     <w:p>
       <w:r>
@@ -178,7 +178,7 @@
 </file>
 
 <file path=word/numbering.xml><?xml version="1.0" encoding="utf-8"?>
-<w:numbering xmlns:wpc="http://schemas.microsoft.com/office/word/2010/wordprocessingCanvas" xmlns:cx="http://schemas.microsoft.com/office/drawing/2014/chartex" xmlns:cx1="http://schemas.microsoft.com/office/drawing/2015/9/8/chartex" xmlns:cx2="http://schemas.microsoft.com/office/drawing/2015/10/21/chartex" xmlns:cx3="http://schemas.microsoft.com/office/drawing/2016/5/9/chartex" xmlns:cx4="http://schemas.microsoft.com/office/drawing/2016/5/10/chartex" xmlns:cx5="http://schemas.microsoft.com/office/drawing/2016/5/11/chartex" xmlns:cx6="http://schemas.microsoft.com/office/drawing/2016/5/12/chartex" xmlns:cx7="http://schemas.microsoft.com/office/drawing/2016/5/13/chartex" xmlns:cx8="http://schemas.microsoft.com/office/drawing/2016/5/14/chartex" xmlns:mc="http://schemas.openxmlformats.org/markup-compatibility/2006" xmlns:aink="http://schemas.microsoft.com/office/drawing/2016/ink" xmlns:am3d="http://schemas.microsoft.com/office/drawing/2017/model3d" xmlns:o="urn:schemas-microsoft-com:office:office" xmlns:r="http://schemas.openxmlformats.org/officeDocument/2006/relationships" xmlns:m="http://schemas.openxmlformats.org/officeDocument/2006/math" xmlns:v="urn:schemas-microsoft-com:vml" xmlns:wp14="http://schemas.microsoft.com/office/word/2010/wordprocessingDrawing" xmlns:wp="http://schemas.openxmlformats.org/drawingml/2006/wordprocessingDrawing" xmlns:w10="urn:schemas-microsoft-com:office:word" xmlns:w="http://schemas.openxmlformats.org/wordprocessingml/2006/main" xmlns:w14="http://schemas.microsoft.com/office/word/2010/wordml" xmlns:w15="http://schemas.microsoft.com/office/word/2012/wordml" xmlns:w16cex="http://schemas.microsoft.com/office/word/2018/wordml/cex" xmlns:w16cid="http://schemas.microsoft.com/office/word/2016/wordml/cid" xmlns:w16="http://schemas.microsoft.com/office/word/2018/wordml" xmlns:w16se="http://schemas.microsoft.com/office/word/2015/wordml/symex" xmlns:wpg="http://schemas.microsoft.com/office/word/2010/wordprocessingGroup" xmlns:wpi="http://schemas.microsoft.com/office/word/2010/wordprocessingInk" xmlns:wne="http://schemas.microsoft.com/office/word/2006/wordml" xmlns:wps="http://schemas.microsoft.com/office/word/2010/wordprocessingShape" mc:Ignorable="w14 w15 w16se w16cid w16 w16cex wp14">
+<w:numbering xmlns:wpc="http://schemas.microsoft.com/office/word/2010/wordprocessingCanvas" xmlns:cx="http://schemas.microsoft.com/office/drawing/2014/chartex" xmlns:cx1="http://schemas.microsoft.com/office/drawing/2015/9/8/chartex" xmlns:cx2="http://schemas.microsoft.com/office/drawing/2015/10/21/chartex" xmlns:cx3="http://schemas.microsoft.com/office/drawing/2016/5/9/chartex" xmlns:cx4="http://schemas.microsoft.com/office/drawing/2016/5/10/chartex" xmlns:cx5="http://schemas.microsoft.com/office/drawing/2016/5/11/chartex" xmlns:cx6="http://schemas.microsoft.com/office/drawing/2016/5/12/chartex" xmlns:cx7="http://schemas.microsoft.com/office/drawing/2016/5/13/chartex" xmlns:cx8="http://schemas.microsoft.com/office/drawing/2016/5/14/chartex" xmlns:mc="http://schemas.openxmlformats.org/markup-compatibility/2006" xmlns:aink="http://schemas.microsoft.com/office/drawing/2016/ink" xmlns:am3d="http://schemas.microsoft.com/office/drawing/2017/model3d" xmlns:o="urn:schemas-microsoft-com:office:office" xmlns:oel="http://schemas.microsoft.com/office/2019/extlst" xmlns:r="http://schemas.openxmlformats.org/officeDocument/2006/relationships" xmlns:m="http://schemas.openxmlformats.org/officeDocument/2006/math" xmlns:v="urn:schemas-microsoft-com:vml" xmlns:wp14="http://schemas.microsoft.com/office/word/2010/wordprocessingDrawing" xmlns:wp="http://schemas.openxmlformats.org/drawingml/2006/wordprocessingDrawing" xmlns:w10="urn:schemas-microsoft-com:office:word" xmlns:w="http://schemas.openxmlformats.org/wordprocessingml/2006/main" xmlns:w14="http://schemas.microsoft.com/office/word/2010/wordml" xmlns:w15="http://schemas.microsoft.com/office/word/2012/wordml" xmlns:w16cex="http://schemas.microsoft.com/office/word/2018/wordml/cex" xmlns:w16cid="http://schemas.microsoft.com/office/word/2016/wordml/cid" xmlns:w16="http://schemas.microsoft.com/office/word/2018/wordml" xmlns:w16du="http://schemas.microsoft.com/office/word/2023/wordml/word16du" xmlns:w16sdtdh="http://schemas.microsoft.com/office/word/2020/wordml/sdtdatahash" xmlns:w16sdtfl="http://schemas.microsoft.com/office/word/2024/wordml/sdtformatlock" xmlns:w16se="http://schemas.microsoft.com/office/word/2015/wordml/symex" xmlns:wpg="http://schemas.microsoft.com/office/word/2010/wordprocessingGroup" xmlns:wpi="http://schemas.microsoft.com/office/word/2010/wordprocessingInk" xmlns:wne="http://schemas.microsoft.com/office/word/2006/wordml" xmlns:wps="http://schemas.microsoft.com/office/word/2010/wordprocessingShape" mc:Ignorable="w14 w15 w16se w16cid w16 w16cex w16sdtdh w16sdtfl w16du wp14">
   <w:abstractNum w:abstractNumId="0" w15:restartNumberingAfterBreak="0">
     <w:nsid w:val="0000A990"/>
     <w:multiLevelType w:val="multilevel"/>
@@ -256,14 +256,14 @@
       </w:pPr>
     </w:lvl>
   </w:abstractNum>
-  <w:num w:numId="1">
+  <w:num w:numId="1" w16cid:durableId="256645075">
     <w:abstractNumId w:val="0"/>
   </w:num>
 </w:numbering>
 </file>
 
 <file path=word/styles.xml><?xml version="1.0" encoding="utf-8"?>
-<w:styles xmlns:mc="http://schemas.openxmlformats.org/markup-compatibility/2006" xmlns:r="http://schemas.openxmlformats.org/officeDocument/2006/relationships" xmlns:w="http://schemas.openxmlformats.org/wordprocessingml/2006/main" xmlns:w14="http://schemas.microsoft.com/office/word/2010/wordml" xmlns:w15="http://schemas.microsoft.com/office/word/2012/wordml" xmlns:w16cex="http://schemas.microsoft.com/office/word/2018/wordml/cex" xmlns:w16cid="http://schemas.microsoft.com/office/word/2016/wordml/cid" xmlns:w16="http://schemas.microsoft.com/office/word/2018/wordml" xmlns:w16se="http://schemas.microsoft.com/office/word/2015/wordml/symex" mc:Ignorable="w14 w15 w16se w16cid w16 w16cex">
+<w:styles xmlns:mc="http://schemas.openxmlformats.org/markup-compatibility/2006" xmlns:r="http://schemas.openxmlformats.org/officeDocument/2006/relationships" xmlns:w="http://schemas.openxmlformats.org/wordprocessingml/2006/main" xmlns:w14="http://schemas.microsoft.com/office/word/2010/wordml" xmlns:w15="http://schemas.microsoft.com/office/word/2012/wordml" xmlns:w16cex="http://schemas.microsoft.com/office/word/2018/wordml/cex" xmlns:w16cid="http://schemas.microsoft.com/office/word/2016/wordml/cid" xmlns:w16="http://schemas.microsoft.com/office/word/2018/wordml" xmlns:w16du="http://schemas.microsoft.com/office/word/2023/wordml/word16du" xmlns:w16sdtdh="http://schemas.microsoft.com/office/word/2020/wordml/sdtdatahash" xmlns:w16sdtfl="http://schemas.microsoft.com/office/word/2024/wordml/sdtformatlock" xmlns:w16se="http://schemas.microsoft.com/office/word/2015/wordml/symex" mc:Ignorable="w14 w15 w16se w16cid w16 w16cex w16sdtdh w16sdtfl w16du">
   <w:docDefaults>
     <w:rPrDefault>
       <w:rPr>
@@ -1081,13 +1081,18 @@
     <w:name w:val="Character"/>
     <w:basedOn w:val="Dialogue"/>
     <w:qFormat/>
+    <w:rsid w:val="00032D8A"/>
+    <w:pPr>
+      <w:spacing w:after="0"/>
+    </w:pPr>
   </w:style>
   <w:style w:type="paragraph" w:customStyle="1" w:styleId="Dialogue">
     <w:name w:val="Dialogue"/>
     <w:basedOn w:val="BodyText"/>
     <w:qFormat/>
-    <w:rsid w:val="00364552"/>
-    <w:pPr>
+    <w:rsid w:val="00032D8A"/>
+    <w:pPr>
+      <w:spacing w:before="0"/>
       <w:ind w:left="2160" w:right="2160"/>
       <w:mirrorIndents/>
     </w:pPr>
@@ -1098,7 +1103,7 @@
     <w:qFormat/>
     <w:rsid w:val="00364552"/>
     <w:pPr>
-      <w:spacing w:before="0" w:after="0"/>
+      <w:spacing w:after="0"/>
       <w:ind w:left="2880"/>
     </w:pPr>
   </w:style>

</xml_diff>